<commit_message>
changes to deal with reviewers comments
</commit_message>
<xml_diff>
--- a/docs/tables/Table1_variance_components.docx
+++ b/docs/tables/Table1_variance_components.docx
@@ -7,7 +7,7 @@
         <w:pStyle w:val="Normal"/>
       </w:pPr>
       <w:r>
-        <w:t xml:space="preserve">Table 1. Variance components in parameters derived from MPMs.</w:t>
+        <w:t xml:space="preserve">Table 1. Sampling-to-other variance ratios for parameters derived from MPMs, with 95% intervals from the variance-component model.</w:t>
       </w:r>
     </w:p>
     <w:tbl xmlns:a="http://schemas.openxmlformats.org/drawingml/2006/main" xmlns:pic="http://schemas.openxmlformats.org/drawingml/2006/picture">
@@ -18,14 +18,14 @@
       </w:tblPr>
       <w:tblGrid>
         <w:gridCol w:w="1927"/>
-        <w:gridCol w:w="3517"/>
+        <w:gridCol w:w="3272"/>
+        <w:gridCol w:w="1621"/>
       </w:tblGrid>
       <w:tr>
         <w:trPr>
-          <w:trHeight w:val="620" w:hRule="auto"/>
+          <w:trHeight w:val="621" w:hRule="auto"/>
           <w:tblHeader/>
         </w:trPr>
-        header1
         <w:tc>
           <w:tcPr>
             <w:tcBorders>
@@ -45,6 +45,7 @@
           </w:tcPr>
           <w:p>
             <w:pPr>
+              <w:pStyle w:val="Normal"/>
               <w:jc w:val="left"/>
               <w:pBdr>
                 <w:bottom w:val="none" w:sz="0" w:space="0" w:color="000000"/>
@@ -99,6 +100,7 @@
           </w:tcPr>
           <w:p>
             <w:pPr>
+              <w:pStyle w:val="Normal"/>
               <w:jc w:val="left"/>
               <w:pBdr>
                 <w:bottom w:val="none" w:sz="0" w:space="0" w:color="000000"/>
@@ -130,7 +132,62 @@
                 <w:szCs w:val="22"/>
                 <w:color w:val="000000"/>
               </w:rPr>
-              <w:t xml:space="preserve">Variance ratio (sampling / point)</w:t>
+              <w:t xml:space="preserve">Sampling:other variance ratio</w:t>
+            </w:r>
+          </w:p>
+        </w:tc>
+        <w:tc>
+          <w:tcPr>
+            <w:tcBorders>
+              <w:bottom w:val="single" w:sz="12" w:space="0" w:color="666666"/>
+              <w:top w:val="single" w:sz="12" w:space="0" w:color="666666"/>
+              <w:left w:val="none" w:sz="0" w:space="0" w:color="000000"/>
+              <w:right w:val="none" w:sz="0" w:space="0" w:color="000000"/>
+            </w:tcBorders>
+            <w:shd w:val="clear" w:color="auto" w:fill="FFFFFF"/>
+            <w:tcMar>
+              <w:top w:w="0" w:type="dxa"/>
+              <w:bottom w:w="0" w:type="dxa"/>
+              <w:left w:w="0" w:type="dxa"/>
+              <w:right w:w="0" w:type="dxa"/>
+            </w:tcMar>
+            <w:vAlign w:val="center"/>
+          </w:tcPr>
+          <w:p>
+            <w:pPr>
+              <w:pStyle w:val="Normal"/>
+              <w:jc w:val="left"/>
+              <w:pBdr>
+                <w:bottom w:val="none" w:sz="0" w:space="0" w:color="000000"/>
+                <w:top w:val="none" w:sz="0" w:space="0" w:color="000000"/>
+                <w:left w:val="none" w:sz="0" w:space="0" w:color="000000"/>
+                <w:right w:val="none" w:sz="0" w:space="0" w:color="000000"/>
+              </w:pBdr>
+              <w:spacing w:after="100" w:before="100" w:line="240"/>
+              <w:ind w:left="100" w:right="100" w:firstLine="0" w:firstLineChars="0"/>
+              <w:rPr>
+                <w:rFonts w:ascii="Helvetica" w:hAnsi="Helvetica" w:eastAsia="Helvetica" w:cs="Helvetica"/>
+                <w:i w:val="false"/>
+                <w:b w:val="false"/>
+                <w:u w:val="none"/>
+                <w:strike w:val="false"/>
+                <w:sz w:val="22"/>
+                <w:szCs w:val="22"/>
+                <w:color w:val="000000"/>
+              </w:rPr>
+            </w:pPr>
+            <w:r>
+              <w:rPr>
+                <w:rFonts w:ascii="Helvetica" w:hAnsi="Helvetica" w:eastAsia="Helvetica" w:cs="Helvetica"/>
+                <w:i w:val="false"/>
+                <w:b w:val="false"/>
+                <w:u w:val="none"/>
+                <w:strike w:val="false"/>
+                <w:sz w:val="22"/>
+                <w:szCs w:val="22"/>
+                <w:color w:val="000000"/>
+              </w:rPr>
+              <w:t xml:space="preserve">95% interval</w:t>
             </w:r>
           </w:p>
         </w:tc>
@@ -139,7 +196,6 @@
         <w:trPr>
           <w:trHeight w:val="615" w:hRule="auto"/>
         </w:trPr>
-        body1
         <w:tc>
           <w:tcPr>
             <w:tcBorders>
@@ -159,6 +215,7 @@
           </w:tcPr>
           <w:p>
             <w:pPr>
+              <w:pStyle w:val="Normal"/>
               <w:jc w:val="left"/>
               <w:pBdr>
                 <w:bottom w:val="none" w:sz="0" w:space="0" w:color="000000"/>
@@ -213,6 +270,7 @@
           </w:tcPr>
           <w:p>
             <w:pPr>
+              <w:pStyle w:val="Normal"/>
               <w:jc w:val="left"/>
               <w:pBdr>
                 <w:bottom w:val="none" w:sz="0" w:space="0" w:color="000000"/>
@@ -248,12 +306,66 @@
             </w:r>
           </w:p>
         </w:tc>
+        <w:tc>
+          <w:tcPr>
+            <w:tcBorders>
+              <w:bottom w:val="none" w:sz="0" w:space="0" w:color="000000"/>
+              <w:top w:val="single" w:sz="12" w:space="0" w:color="666666"/>
+              <w:left w:val="none" w:sz="0" w:space="0" w:color="000000"/>
+              <w:right w:val="none" w:sz="0" w:space="0" w:color="000000"/>
+            </w:tcBorders>
+            <w:shd w:val="clear" w:color="auto" w:fill="FFFFFF"/>
+            <w:tcMar>
+              <w:top w:w="0" w:type="dxa"/>
+              <w:bottom w:w="0" w:type="dxa"/>
+              <w:left w:w="0" w:type="dxa"/>
+              <w:right w:w="0" w:type="dxa"/>
+            </w:tcMar>
+            <w:vAlign w:val="center"/>
+          </w:tcPr>
+          <w:p>
+            <w:pPr>
+              <w:pStyle w:val="Normal"/>
+              <w:jc w:val="left"/>
+              <w:pBdr>
+                <w:bottom w:val="none" w:sz="0" w:space="0" w:color="000000"/>
+                <w:top w:val="none" w:sz="0" w:space="0" w:color="000000"/>
+                <w:left w:val="none" w:sz="0" w:space="0" w:color="000000"/>
+                <w:right w:val="none" w:sz="0" w:space="0" w:color="000000"/>
+              </w:pBdr>
+              <w:spacing w:after="100" w:before="100" w:line="240"/>
+              <w:ind w:left="100" w:right="100" w:firstLine="0" w:firstLineChars="0"/>
+              <w:rPr>
+                <w:rFonts w:ascii="Helvetica" w:hAnsi="Helvetica" w:eastAsia="Helvetica" w:cs="Helvetica"/>
+                <w:i w:val="false"/>
+                <w:b w:val="false"/>
+                <w:u w:val="none"/>
+                <w:strike w:val="false"/>
+                <w:sz w:val="22"/>
+                <w:szCs w:val="22"/>
+                <w:color w:val="000000"/>
+              </w:rPr>
+            </w:pPr>
+            <w:r>
+              <w:rPr>
+                <w:rFonts w:ascii="Helvetica" w:hAnsi="Helvetica" w:eastAsia="Helvetica" w:cs="Helvetica"/>
+                <w:i w:val="false"/>
+                <w:b w:val="false"/>
+                <w:u w:val="none"/>
+                <w:strike w:val="false"/>
+                <w:sz w:val="22"/>
+                <w:szCs w:val="22"/>
+                <w:color w:val="000000"/>
+              </w:rPr>
+              <w:t xml:space="preserve">[2.26, 5.06]</w:t>
+            </w:r>
+          </w:p>
+        </w:tc>
       </w:tr>
       <w:tr>
         <w:trPr>
           <w:trHeight w:val="618" w:hRule="auto"/>
         </w:trPr>
-        body2
         <w:tc>
           <w:tcPr>
             <w:tcBorders>
@@ -273,6 +385,7 @@
           </w:tcPr>
           <w:p>
             <w:pPr>
+              <w:pStyle w:val="Normal"/>
               <w:jc w:val="left"/>
               <w:pBdr>
                 <w:bottom w:val="none" w:sz="0" w:space="0" w:color="000000"/>
@@ -327,6 +440,7 @@
           </w:tcPr>
           <w:p>
             <w:pPr>
+              <w:pStyle w:val="Normal"/>
               <w:jc w:val="left"/>
               <w:pBdr>
                 <w:bottom w:val="none" w:sz="0" w:space="0" w:color="000000"/>
@@ -362,12 +476,6 @@
             </w:r>
           </w:p>
         </w:tc>
-      </w:tr>
-      <w:tr>
-        <w:trPr>
-          <w:trHeight w:val="617" w:hRule="auto"/>
-        </w:trPr>
-        body3
         <w:tc>
           <w:tcPr>
             <w:tcBorders>
@@ -387,6 +495,67 @@
           </w:tcPr>
           <w:p>
             <w:pPr>
+              <w:pStyle w:val="Normal"/>
+              <w:jc w:val="left"/>
+              <w:pBdr>
+                <w:bottom w:val="none" w:sz="0" w:space="0" w:color="000000"/>
+                <w:top w:val="none" w:sz="0" w:space="0" w:color="000000"/>
+                <w:left w:val="none" w:sz="0" w:space="0" w:color="000000"/>
+                <w:right w:val="none" w:sz="0" w:space="0" w:color="000000"/>
+              </w:pBdr>
+              <w:spacing w:after="100" w:before="100" w:line="240"/>
+              <w:ind w:left="100" w:right="100" w:firstLine="0" w:firstLineChars="0"/>
+              <w:rPr>
+                <w:rFonts w:ascii="Helvetica" w:hAnsi="Helvetica" w:eastAsia="Helvetica" w:cs="Helvetica"/>
+                <w:i w:val="false"/>
+                <w:b w:val="false"/>
+                <w:u w:val="none"/>
+                <w:strike w:val="false"/>
+                <w:sz w:val="22"/>
+                <w:szCs w:val="22"/>
+                <w:color w:val="000000"/>
+              </w:rPr>
+            </w:pPr>
+            <w:r>
+              <w:rPr>
+                <w:rFonts w:ascii="Helvetica" w:hAnsi="Helvetica" w:eastAsia="Helvetica" w:cs="Helvetica"/>
+                <w:i w:val="false"/>
+                <w:b w:val="false"/>
+                <w:u w:val="none"/>
+                <w:strike w:val="false"/>
+                <w:sz w:val="22"/>
+                <w:szCs w:val="22"/>
+                <w:color w:val="000000"/>
+              </w:rPr>
+              <w:t xml:space="preserve">[1.48, 2.55]</w:t>
+            </w:r>
+          </w:p>
+        </w:tc>
+      </w:tr>
+      <w:tr>
+        <w:trPr>
+          <w:trHeight w:val="617" w:hRule="auto"/>
+        </w:trPr>
+        <w:tc>
+          <w:tcPr>
+            <w:tcBorders>
+              <w:bottom w:val="none" w:sz="0" w:space="0" w:color="000000"/>
+              <w:top w:val="none" w:sz="0" w:space="0" w:color="000000"/>
+              <w:left w:val="none" w:sz="0" w:space="0" w:color="000000"/>
+              <w:right w:val="none" w:sz="0" w:space="0" w:color="000000"/>
+            </w:tcBorders>
+            <w:shd w:val="clear" w:color="auto" w:fill="FFFFFF"/>
+            <w:tcMar>
+              <w:top w:w="0" w:type="dxa"/>
+              <w:bottom w:w="0" w:type="dxa"/>
+              <w:left w:w="0" w:type="dxa"/>
+              <w:right w:w="0" w:type="dxa"/>
+            </w:tcMar>
+            <w:vAlign w:val="center"/>
+          </w:tcPr>
+          <w:p>
+            <w:pPr>
+              <w:pStyle w:val="Normal"/>
               <w:jc w:val="left"/>
               <w:pBdr>
                 <w:bottom w:val="none" w:sz="0" w:space="0" w:color="000000"/>
@@ -441,6 +610,7 @@
           </w:tcPr>
           <w:p>
             <w:pPr>
+              <w:pStyle w:val="Normal"/>
               <w:jc w:val="left"/>
               <w:pBdr>
                 <w:bottom w:val="none" w:sz="0" w:space="0" w:color="000000"/>
@@ -476,12 +646,6 @@
             </w:r>
           </w:p>
         </w:tc>
-      </w:tr>
-      <w:tr>
-        <w:trPr>
-          <w:trHeight w:val="615" w:hRule="auto"/>
-        </w:trPr>
-        body4
         <w:tc>
           <w:tcPr>
             <w:tcBorders>
@@ -501,6 +665,67 @@
           </w:tcPr>
           <w:p>
             <w:pPr>
+              <w:pStyle w:val="Normal"/>
+              <w:jc w:val="left"/>
+              <w:pBdr>
+                <w:bottom w:val="none" w:sz="0" w:space="0" w:color="000000"/>
+                <w:top w:val="none" w:sz="0" w:space="0" w:color="000000"/>
+                <w:left w:val="none" w:sz="0" w:space="0" w:color="000000"/>
+                <w:right w:val="none" w:sz="0" w:space="0" w:color="000000"/>
+              </w:pBdr>
+              <w:spacing w:after="100" w:before="100" w:line="240"/>
+              <w:ind w:left="100" w:right="100" w:firstLine="0" w:firstLineChars="0"/>
+              <w:rPr>
+                <w:rFonts w:ascii="Helvetica" w:hAnsi="Helvetica" w:eastAsia="Helvetica" w:cs="Helvetica"/>
+                <w:i w:val="false"/>
+                <w:b w:val="false"/>
+                <w:u w:val="none"/>
+                <w:strike w:val="false"/>
+                <w:sz w:val="22"/>
+                <w:szCs w:val="22"/>
+                <w:color w:val="000000"/>
+              </w:rPr>
+            </w:pPr>
+            <w:r>
+              <w:rPr>
+                <w:rFonts w:ascii="Helvetica" w:hAnsi="Helvetica" w:eastAsia="Helvetica" w:cs="Helvetica"/>
+                <w:i w:val="false"/>
+                <w:b w:val="false"/>
+                <w:u w:val="none"/>
+                <w:strike w:val="false"/>
+                <w:sz w:val="22"/>
+                <w:szCs w:val="22"/>
+                <w:color w:val="000000"/>
+              </w:rPr>
+              <w:t xml:space="preserve">[0.99, 1.15]</w:t>
+            </w:r>
+          </w:p>
+        </w:tc>
+      </w:tr>
+      <w:tr>
+        <w:trPr>
+          <w:trHeight w:val="615" w:hRule="auto"/>
+        </w:trPr>
+        <w:tc>
+          <w:tcPr>
+            <w:tcBorders>
+              <w:bottom w:val="none" w:sz="0" w:space="0" w:color="000000"/>
+              <w:top w:val="none" w:sz="0" w:space="0" w:color="000000"/>
+              <w:left w:val="none" w:sz="0" w:space="0" w:color="000000"/>
+              <w:right w:val="none" w:sz="0" w:space="0" w:color="000000"/>
+            </w:tcBorders>
+            <w:shd w:val="clear" w:color="auto" w:fill="FFFFFF"/>
+            <w:tcMar>
+              <w:top w:w="0" w:type="dxa"/>
+              <w:bottom w:w="0" w:type="dxa"/>
+              <w:left w:w="0" w:type="dxa"/>
+              <w:right w:w="0" w:type="dxa"/>
+            </w:tcMar>
+            <w:vAlign w:val="center"/>
+          </w:tcPr>
+          <w:p>
+            <w:pPr>
+              <w:pStyle w:val="Normal"/>
               <w:jc w:val="left"/>
               <w:pBdr>
                 <w:bottom w:val="none" w:sz="0" w:space="0" w:color="000000"/>
@@ -555,6 +780,7 @@
           </w:tcPr>
           <w:p>
             <w:pPr>
+              <w:pStyle w:val="Normal"/>
               <w:jc w:val="left"/>
               <w:pBdr>
                 <w:bottom w:val="none" w:sz="0" w:space="0" w:color="000000"/>
@@ -590,12 +816,6 @@
             </w:r>
           </w:p>
         </w:tc>
-      </w:tr>
-      <w:tr>
-        <w:trPr>
-          <w:trHeight w:val="577" w:hRule="auto"/>
-        </w:trPr>
-        body5
         <w:tc>
           <w:tcPr>
             <w:tcBorders>
@@ -615,6 +835,67 @@
           </w:tcPr>
           <w:p>
             <w:pPr>
+              <w:pStyle w:val="Normal"/>
+              <w:jc w:val="left"/>
+              <w:pBdr>
+                <w:bottom w:val="none" w:sz="0" w:space="0" w:color="000000"/>
+                <w:top w:val="none" w:sz="0" w:space="0" w:color="000000"/>
+                <w:left w:val="none" w:sz="0" w:space="0" w:color="000000"/>
+                <w:right w:val="none" w:sz="0" w:space="0" w:color="000000"/>
+              </w:pBdr>
+              <w:spacing w:after="100" w:before="100" w:line="240"/>
+              <w:ind w:left="100" w:right="100" w:firstLine="0" w:firstLineChars="0"/>
+              <w:rPr>
+                <w:rFonts w:ascii="Helvetica" w:hAnsi="Helvetica" w:eastAsia="Helvetica" w:cs="Helvetica"/>
+                <w:i w:val="false"/>
+                <w:b w:val="false"/>
+                <w:u w:val="none"/>
+                <w:strike w:val="false"/>
+                <w:sz w:val="22"/>
+                <w:szCs w:val="22"/>
+                <w:color w:val="000000"/>
+              </w:rPr>
+            </w:pPr>
+            <w:r>
+              <w:rPr>
+                <w:rFonts w:ascii="Helvetica" w:hAnsi="Helvetica" w:eastAsia="Helvetica" w:cs="Helvetica"/>
+                <w:i w:val="false"/>
+                <w:b w:val="false"/>
+                <w:u w:val="none"/>
+                <w:strike w:val="false"/>
+                <w:sz w:val="22"/>
+                <w:szCs w:val="22"/>
+                <w:color w:val="000000"/>
+              </w:rPr>
+              <w:t xml:space="preserve">[1.01, 1.29]</w:t>
+            </w:r>
+          </w:p>
+        </w:tc>
+      </w:tr>
+      <w:tr>
+        <w:trPr>
+          <w:trHeight w:val="613" w:hRule="auto"/>
+        </w:trPr>
+        <w:tc>
+          <w:tcPr>
+            <w:tcBorders>
+              <w:bottom w:val="none" w:sz="0" w:space="0" w:color="000000"/>
+              <w:top w:val="none" w:sz="0" w:space="0" w:color="000000"/>
+              <w:left w:val="none" w:sz="0" w:space="0" w:color="000000"/>
+              <w:right w:val="none" w:sz="0" w:space="0" w:color="000000"/>
+            </w:tcBorders>
+            <w:shd w:val="clear" w:color="auto" w:fill="FFFFFF"/>
+            <w:tcMar>
+              <w:top w:w="0" w:type="dxa"/>
+              <w:bottom w:w="0" w:type="dxa"/>
+              <w:left w:w="0" w:type="dxa"/>
+              <w:right w:w="0" w:type="dxa"/>
+            </w:tcMar>
+            <w:vAlign w:val="center"/>
+          </w:tcPr>
+          <w:p>
+            <w:pPr>
+              <w:pStyle w:val="Normal"/>
               <w:jc w:val="left"/>
               <w:pBdr>
                 <w:bottom w:val="none" w:sz="0" w:space="0" w:color="000000"/>
@@ -669,6 +950,7 @@
           </w:tcPr>
           <w:p>
             <w:pPr>
+              <w:pStyle w:val="Normal"/>
               <w:jc w:val="left"/>
               <w:pBdr>
                 <w:bottom w:val="none" w:sz="0" w:space="0" w:color="000000"/>
@@ -704,12 +986,66 @@
             </w:r>
           </w:p>
         </w:tc>
+        <w:tc>
+          <w:tcPr>
+            <w:tcBorders>
+              <w:bottom w:val="none" w:sz="0" w:space="0" w:color="000000"/>
+              <w:top w:val="none" w:sz="0" w:space="0" w:color="000000"/>
+              <w:left w:val="none" w:sz="0" w:space="0" w:color="000000"/>
+              <w:right w:val="none" w:sz="0" w:space="0" w:color="000000"/>
+            </w:tcBorders>
+            <w:shd w:val="clear" w:color="auto" w:fill="FFFFFF"/>
+            <w:tcMar>
+              <w:top w:w="0" w:type="dxa"/>
+              <w:bottom w:w="0" w:type="dxa"/>
+              <w:left w:w="0" w:type="dxa"/>
+              <w:right w:w="0" w:type="dxa"/>
+            </w:tcMar>
+            <w:vAlign w:val="center"/>
+          </w:tcPr>
+          <w:p>
+            <w:pPr>
+              <w:pStyle w:val="Normal"/>
+              <w:jc w:val="left"/>
+              <w:pBdr>
+                <w:bottom w:val="none" w:sz="0" w:space="0" w:color="000000"/>
+                <w:top w:val="none" w:sz="0" w:space="0" w:color="000000"/>
+                <w:left w:val="none" w:sz="0" w:space="0" w:color="000000"/>
+                <w:right w:val="none" w:sz="0" w:space="0" w:color="000000"/>
+              </w:pBdr>
+              <w:spacing w:after="100" w:before="100" w:line="240"/>
+              <w:ind w:left="100" w:right="100" w:firstLine="0" w:firstLineChars="0"/>
+              <w:rPr>
+                <w:rFonts w:ascii="Helvetica" w:hAnsi="Helvetica" w:eastAsia="Helvetica" w:cs="Helvetica"/>
+                <w:i w:val="false"/>
+                <w:b w:val="false"/>
+                <w:u w:val="none"/>
+                <w:strike w:val="false"/>
+                <w:sz w:val="22"/>
+                <w:szCs w:val="22"/>
+                <w:color w:val="000000"/>
+              </w:rPr>
+            </w:pPr>
+            <w:r>
+              <w:rPr>
+                <w:rFonts w:ascii="Helvetica" w:hAnsi="Helvetica" w:eastAsia="Helvetica" w:cs="Helvetica"/>
+                <w:i w:val="false"/>
+                <w:b w:val="false"/>
+                <w:u w:val="none"/>
+                <w:strike w:val="false"/>
+                <w:sz w:val="22"/>
+                <w:szCs w:val="22"/>
+                <w:color w:val="000000"/>
+              </w:rPr>
+              <w:t xml:space="preserve">[1.20, 2.22]</w:t>
+            </w:r>
+          </w:p>
+        </w:tc>
       </w:tr>
       <w:tr>
         <w:trPr>
-          <w:trHeight w:val="604" w:hRule="auto"/>
+          <w:trHeight w:val="613" w:hRule="auto"/>
         </w:trPr>
-        body6
         <w:tc>
           <w:tcPr>
             <w:tcBorders>
@@ -729,6 +1065,7 @@
           </w:tcPr>
           <w:p>
             <w:pPr>
+              <w:pStyle w:val="Normal"/>
               <w:jc w:val="left"/>
               <w:pBdr>
                 <w:bottom w:val="none" w:sz="0" w:space="0" w:color="000000"/>
@@ -783,6 +1120,7 @@
           </w:tcPr>
           <w:p>
             <w:pPr>
+              <w:pStyle w:val="Normal"/>
               <w:jc w:val="left"/>
               <w:pBdr>
                 <w:bottom w:val="none" w:sz="0" w:space="0" w:color="000000"/>
@@ -815,6 +1153,61 @@
                 <w:color w:val="000000"/>
               </w:rPr>
               <w:t xml:space="preserve">1.62</w:t>
+            </w:r>
+          </w:p>
+        </w:tc>
+        <w:tc>
+          <w:tcPr>
+            <w:tcBorders>
+              <w:bottom w:val="single" w:sz="12" w:space="0" w:color="666666"/>
+              <w:top w:val="none" w:sz="0" w:space="0" w:color="000000"/>
+              <w:left w:val="none" w:sz="0" w:space="0" w:color="000000"/>
+              <w:right w:val="none" w:sz="0" w:space="0" w:color="000000"/>
+            </w:tcBorders>
+            <w:shd w:val="clear" w:color="auto" w:fill="FFFFFF"/>
+            <w:tcMar>
+              <w:top w:w="0" w:type="dxa"/>
+              <w:bottom w:w="0" w:type="dxa"/>
+              <w:left w:w="0" w:type="dxa"/>
+              <w:right w:w="0" w:type="dxa"/>
+            </w:tcMar>
+            <w:vAlign w:val="center"/>
+          </w:tcPr>
+          <w:p>
+            <w:pPr>
+              <w:pStyle w:val="Normal"/>
+              <w:jc w:val="left"/>
+              <w:pBdr>
+                <w:bottom w:val="none" w:sz="0" w:space="0" w:color="000000"/>
+                <w:top w:val="none" w:sz="0" w:space="0" w:color="000000"/>
+                <w:left w:val="none" w:sz="0" w:space="0" w:color="000000"/>
+                <w:right w:val="none" w:sz="0" w:space="0" w:color="000000"/>
+              </w:pBdr>
+              <w:spacing w:after="100" w:before="100" w:line="240"/>
+              <w:ind w:left="100" w:right="100" w:firstLine="0" w:firstLineChars="0"/>
+              <w:rPr>
+                <w:rFonts w:ascii="Helvetica" w:hAnsi="Helvetica" w:eastAsia="Helvetica" w:cs="Helvetica"/>
+                <w:i w:val="false"/>
+                <w:b w:val="false"/>
+                <w:u w:val="none"/>
+                <w:strike w:val="false"/>
+                <w:sz w:val="22"/>
+                <w:szCs w:val="22"/>
+                <w:color w:val="000000"/>
+              </w:rPr>
+            </w:pPr>
+            <w:r>
+              <w:rPr>
+                <w:rFonts w:ascii="Helvetica" w:hAnsi="Helvetica" w:eastAsia="Helvetica" w:cs="Helvetica"/>
+                <w:i w:val="false"/>
+                <w:b w:val="false"/>
+                <w:u w:val="none"/>
+                <w:strike w:val="false"/>
+                <w:sz w:val="22"/>
+                <w:szCs w:val="22"/>
+                <w:color w:val="000000"/>
+              </w:rPr>
+              <w:t xml:space="preserve">[1.08, 2.59]</w:t>
             </w:r>
           </w:p>
         </w:tc>

</xml_diff>